<commit_message>
Write example functions in dynamic documentation to serve as logic points for Prysma.
</commit_message>
<xml_diff>
--- a/Documents/AnalyseFonctionnelle/Raphael Arseneault Analyse fonctionnelle et organique.docx
+++ b/Documents/AnalyseFonctionnelle/Raphael Arseneault Analyse fonctionnelle et organique.docx
@@ -1387,10 +1387,6 @@
         <w:ind/>
         <w:rPr>
           <w:rFonts w:asciiTheme="majorHAnsi" w:hAnsiTheme="majorHAnsi" w:eastAsiaTheme="majorEastAsia" w:cstheme="majorBidi"/>
-          <w:color w:val="104861" w:themeColor="accent1" w:themeShade="BF"/>
-          <w:sz w:val="40"/>
-          <w:szCs w:val="40"/>
-          <w:lang w:val="fr-FR"/>
         </w:rPr>
       </w:pPr>
       <w:r>
@@ -1404,16 +1400,19 @@
         </w:rPr>
       </w:r>
       <w:r>
-        <w:t xml:space="preserve">On commence par traiter un fichier texte contenant le code source Prysma. Il est chargé en mémoire et envoyé au lexer. Le lexer se charge de transformer le fichier texte en vecteur de tokens, chaque token contient un identifiant et une string </w:t>
+        <w:t xml:space="preserve">On commence par traiter un fichier texte contenant le code source Prysma. Il est chargé en mémoire et envoyé au lexer. Le lexer se charge de transformer le fichier texte en vecteur de tokens, chaque token contient un identifiant et une string value. Il sép</w:t>
       </w:r>
       <w:r>
-        <w:t xml:space="preserve">value. Il sépare mot à mot chaque token en lui attribuant son identifiant propre. Tout superflu n’est pas traité par le lexer : espaces, caractères invalides non disponibles dans le langage s’il y a lieu. Ensuite, le vecteur de tokens est envoyé vers le pa</w:t>
+        <w:t xml:space="preserve">are mot à mot chaque token en lui attribuant son propre identifiant. Tout superflu n’est pas traité par le lexer : espaces, caractères invalides non disponibles dans le langage s’il y a lieu. Ensuite, le vecteur de tokens est envoyé vers le parseur, la cla</w:t>
       </w:r>
       <w:r>
-        <w:t xml:space="preserve">rseur, la classe curseur sera en charge de parcourir le vecteur de tokens avec l’algorithme de décente récursive pour construire l’arbre approprié avec les nœuds conformes pour celui-ci. Un arbre syntaxique complet en sortira. Ensuite, dans le main, l’exécution de l’arbre syntaxique sera faite </w:t>
+        <w:t xml:space="preserve">sse curseur sera en charge de parcourir le vecteur de tokens avec l’algorithme de descente récursive pour construire l’arbre approprié avec les nœuds conformes pour celui-ci. Un arbre syntaxique complet en sortira. Ensuite, dans le main, l’utilisation du p</w:t>
       </w:r>
       <w:r>
-        <w:t xml:space="preserve">et récursivement tous les nœuds seront appelés un à la suite de l’autre pour exécuter la logique de construction du code LLVM. Le backend LLVM se chargera de traduire le code intermédiaire en code assembleur, puis en code machine exécutable.</w:t>
+        <w:t xml:space="preserve">arcours en profondeur sera utilisée pour parcourir récursivement l’arbre syntaxique abstrait, chaque nœud pourra alors construire le code intermédiaire en utilisant le framework LLVM. Le backend LLVM se chargera de traduire le code intermédiaire en code as</w:t>
+      </w:r>
+      <w:r>
+        <w:t xml:space="preserve">sembleur, puis en code machine exécutable.</w:t>
       </w:r>
       <w:r>
         <w:rPr>
@@ -1428,11 +1427,6 @@
       <w:r>
         <w:rPr>
           <w:rFonts w:asciiTheme="majorHAnsi" w:hAnsiTheme="majorHAnsi" w:eastAsiaTheme="majorEastAsia" w:cstheme="majorBidi"/>
-          <w:color w:val="0f4761" w:themeColor="accent1" w:themeShade="BF"/>
-          <w:sz w:val="40"/>
-          <w:szCs w:val="40"/>
-          <w:highlight w:val="none"/>
-          <w:lang w:val="fr-FR" w:bidi="fr-FR"/>
         </w:rPr>
       </w:r>
     </w:p>

</xml_diff>

<commit_message>
Fix spelling errors in the functional analysis document.
</commit_message>
<xml_diff>
--- a/Documents/AnalyseFonctionnelle/Raphael Arseneault Analyse fonctionnelle et organique.docx
+++ b/Documents/AnalyseFonctionnelle/Raphael Arseneault Analyse fonctionnelle et organique.docx
@@ -1545,65 +1545,39 @@
         <w:pBdr/>
         <w:spacing/>
         <w:ind/>
-        <w:rPr>
-          <w:highlight w:val="none"/>
-          <w:lang w:val="fr-FR" w:bidi="fr-FR"/>
-        </w:rPr>
+        <w:rPr/>
       </w:pPr>
       <w:r>
         <w:rPr>
           <w:highlight w:val="none"/>
           <w:lang w:val="fr-FR" w:bidi="fr-FR"/>
         </w:rPr>
-        <w:t xml:space="preserve">// algorithme pour atteindre le dernier token d’une instruction</w:t>
+        <w:t xml:space="preserve">// algorithme pour atteindre le dernier token d’une instruction c’est pour obtenir un intervalle entre deux nombres et envoyer cet intervalle à l'enfant pour le traiter</w:t>
       </w:r>
+      <w:r/>
+    </w:p>
+    <w:p>
+      <w:pPr>
+        <w:pBdr/>
+        <w:spacing/>
+        <w:ind/>
+        <w:rPr/>
+      </w:pPr>
       <w:r>
         <w:rPr>
           <w:highlight w:val="none"/>
           <w:lang w:val="fr-FR" w:bidi="fr-FR"/>
         </w:rPr>
-        <w:t xml:space="preserve"> c’est pour obtenir un intervale entre deux nombre et envoyer cette intervale au enfant pour le traiter</w:t>
+        <w:t xml:space="preserve">int avancerFinInstruction(int indexActuel)</w:t>
       </w:r>
-      <w:r>
-        <w:rPr>
-          <w:highlight w:val="none"/>
-          <w:lang w:val="fr-FR" w:bidi="fr-FR"/>
-        </w:rPr>
-      </w:r>
+      <w:r/>
     </w:p>
     <w:p>
       <w:pPr>
         <w:pBdr/>
         <w:spacing/>
         <w:ind/>
-        <w:rPr>
-          <w:highlight w:val="none"/>
-          <w:lang w:val="fr-FR" w:bidi="fr-FR"/>
-        </w:rPr>
-      </w:pPr>
-      <w:r>
-        <w:rPr>
-          <w:highlight w:val="none"/>
-          <w:lang w:val="fr-FR" w:bidi="fr-FR"/>
-        </w:rPr>
-        <w:t xml:space="preserve">int avancerFinInstruction(int indexActuelle)</w:t>
-      </w:r>
-      <w:r>
-        <w:rPr>
-          <w:highlight w:val="none"/>
-          <w:lang w:val="fr-FR" w:bidi="fr-FR"/>
-        </w:rPr>
-      </w:r>
-    </w:p>
-    <w:p>
-      <w:pPr>
-        <w:pBdr/>
-        <w:spacing/>
-        <w:ind/>
-        <w:rPr>
-          <w:highlight w:val="none"/>
-          <w:lang w:val="fr-FR" w:bidi="fr-FR"/>
-        </w:rPr>
+        <w:rPr/>
       </w:pPr>
       <w:r>
         <w:rPr>
@@ -1613,22 +1587,14 @@
         <w:t xml:space="preserve">{</w:t>
         <w:tab/>
       </w:r>
-      <w:r>
-        <w:rPr>
-          <w:highlight w:val="none"/>
-          <w:lang w:val="fr-FR" w:bidi="fr-FR"/>
-        </w:rPr>
-      </w:r>
+      <w:r/>
     </w:p>
     <w:p>
       <w:pPr>
         <w:pBdr/>
         <w:spacing/>
         <w:ind/>
-        <w:rPr>
-          <w:highlight w:val="none"/>
-          <w:lang w:val="fr-FR" w:bidi="fr-FR"/>
-        </w:rPr>
+        <w:rPr/>
       </w:pPr>
       <w:r>
         <w:rPr>
@@ -1636,42 +1602,16 @@
           <w:lang w:val="fr-FR" w:bidi="fr-FR"/>
         </w:rPr>
         <w:tab/>
-        <w:t xml:space="preserve">int i = indexActuelle ; </w:t>
+        <w:t xml:space="preserve">int i = indexActuel ; </w:t>
       </w:r>
-      <w:r>
-        <w:rPr>
-          <w:highlight w:val="none"/>
-          <w:lang w:val="fr-FR" w:bidi="fr-FR"/>
-        </w:rPr>
-      </w:r>
-      <w:r>
-        <w:rPr>
-          <w:highlight w:val="none"/>
-          <w:lang w:val="fr-FR" w:bidi="fr-FR"/>
-        </w:rPr>
-      </w:r>
-      <w:r>
-        <w:rPr>
-          <w:highlight w:val="none"/>
-          <w:lang w:val="fr-FR" w:bidi="fr-FR"/>
-        </w:rPr>
-      </w:r>
-      <w:r>
-        <w:rPr>
-          <w:highlight w:val="none"/>
-          <w:lang w:val="fr-FR" w:bidi="fr-FR"/>
-        </w:rPr>
-      </w:r>
+      <w:r/>
     </w:p>
     <w:p>
       <w:pPr>
         <w:pBdr/>
         <w:spacing/>
-        <w:ind w:left="709"/>
-        <w:rPr>
-          <w:highlight w:val="none"/>
-          <w:lang w:val="fr-FR" w:bidi="fr-FR"/>
-        </w:rPr>
+        <w:ind/>
+        <w:rPr/>
       </w:pPr>
       <w:r>
         <w:rPr>
@@ -1679,43 +1619,18 @@
           <w:lang w:val="fr-FR" w:bidi="fr-FR"/>
         </w:rPr>
         <w:tab/>
+        <w:t xml:space="preserve">Tant que (token type n’est pas à la fin d’une instruction indiquée par un ; on </w:t>
+        <w:tab/>
+        <w:t xml:space="preserve">continue ; )</w:t>
       </w:r>
-      <w:r>
-        <w:rPr>
-          <w:highlight w:val="none"/>
-          <w:lang w:val="fr-FR" w:bidi="fr-FR"/>
-        </w:rPr>
-        <w:t xml:space="preserve">Tant que (token type n’est pas </w:t>
-      </w:r>
-      <w:r>
-        <w:rPr>
-          <w:highlight w:val="none"/>
-          <w:lang w:val="fr-FR" w:bidi="fr-FR"/>
-        </w:rPr>
-        <w:t xml:space="preserve">à la fin d’une instruction indiqué par un ; on continue ; )</w:t>
-      </w:r>
-      <w:r>
-        <w:rPr>
-          <w:highlight w:val="none"/>
-          <w:lang w:val="fr-FR" w:bidi="fr-FR"/>
-        </w:rPr>
-      </w:r>
-      <w:r>
-        <w:rPr>
-          <w:highlight w:val="none"/>
-          <w:lang w:val="fr-FR" w:bidi="fr-FR"/>
-        </w:rPr>
-      </w:r>
+      <w:r/>
     </w:p>
     <w:p>
       <w:pPr>
         <w:pBdr/>
         <w:spacing/>
-        <w:ind w:left="709"/>
-        <w:rPr>
-          <w:highlight w:val="none"/>
-          <w:lang w:val="fr-FR" w:bidi="fr-FR"/>
-        </w:rPr>
+        <w:ind w:firstLine="720"/>
+        <w:rPr/>
       </w:pPr>
       <w:r>
         <w:rPr>
@@ -1724,22 +1639,14 @@
         </w:rPr>
         <w:t xml:space="preserve">{</w:t>
       </w:r>
-      <w:r>
-        <w:rPr>
-          <w:highlight w:val="none"/>
-          <w:lang w:val="fr-FR" w:bidi="fr-FR"/>
-        </w:rPr>
-      </w:r>
+      <w:r/>
     </w:p>
     <w:p>
       <w:pPr>
         <w:pBdr/>
         <w:spacing/>
-        <w:ind w:left="709"/>
-        <w:rPr>
-          <w:highlight w:val="none"/>
-          <w:lang w:val="fr-FR" w:bidi="fr-FR"/>
-        </w:rPr>
+        <w:ind/>
+        <w:rPr/>
       </w:pPr>
       <w:r>
         <w:rPr>
@@ -1748,44 +1655,50 @@
         </w:rPr>
         <w:tab/>
         <w:tab/>
+        <w:t xml:space="preserve">indexActuel ++ ;</w:t>
       </w:r>
+      <w:r/>
+    </w:p>
+    <w:p>
+      <w:pPr>
+        <w:pBdr/>
+        <w:spacing/>
+        <w:ind w:firstLine="720"/>
+        <w:rPr/>
+      </w:pPr>
       <w:r>
         <w:rPr>
           <w:highlight w:val="none"/>
           <w:lang w:val="fr-FR" w:bidi="fr-FR"/>
         </w:rPr>
-        <w:t xml:space="preserve">indexActuelle ++</w:t>
+        <w:t xml:space="preserve">}</w:t>
+        <w:tab/>
+        <w:tab/>
       </w:r>
       <w:r/>
+    </w:p>
+    <w:p>
+      <w:pPr>
+        <w:pBdr/>
+        <w:spacing/>
+        <w:ind w:firstLine="720"/>
+        <w:rPr/>
+      </w:pPr>
       <w:r>
         <w:rPr>
           <w:highlight w:val="none"/>
           <w:lang w:val="fr-FR" w:bidi="fr-FR"/>
         </w:rPr>
-        <w:t xml:space="preserve"> ;</w:t>
+        <w:t xml:space="preserve">return indexActuel ;</w:t>
       </w:r>
-      <w:r>
-        <w:rPr>
-          <w:highlight w:val="none"/>
-          <w:lang w:val="fr-FR" w:bidi="fr-FR"/>
-        </w:rPr>
-      </w:r>
-      <w:r>
-        <w:rPr>
-          <w:highlight w:val="none"/>
-          <w:lang w:val="fr-FR" w:bidi="fr-FR"/>
-        </w:rPr>
-      </w:r>
+      <w:r/>
     </w:p>
     <w:p>
       <w:pPr>
         <w:pBdr/>
         <w:spacing/>
-        <w:ind w:left="709"/>
-        <w:rPr>
-          <w:highlight w:val="none"/>
-          <w:lang w:val="fr-FR" w:bidi="fr-FR"/>
-        </w:rPr>
+        <w:ind/>
+        <w:rPr/>
       </w:pPr>
       <w:r>
         <w:rPr>
@@ -1794,152 +1707,42 @@
         </w:rPr>
         <w:t xml:space="preserve">}</w:t>
       </w:r>
+      <w:r/>
+    </w:p>
+    <w:p>
+      <w:pPr>
+        <w:pBdr/>
+        <w:spacing/>
+        <w:ind/>
+        <w:rPr/>
+      </w:pPr>
       <w:r>
         <w:rPr>
           <w:highlight w:val="none"/>
           <w:lang w:val="fr-FR" w:bidi="fr-FR"/>
         </w:rPr>
       </w:r>
+      <w:r/>
+    </w:p>
+    <w:p>
+      <w:pPr>
+        <w:pBdr/>
+        <w:spacing/>
+        <w:ind/>
+        <w:rPr/>
+      </w:pPr>
       <w:r>
         <w:rPr>
           <w:highlight w:val="none"/>
           <w:lang w:val="fr-FR" w:bidi="fr-FR"/>
         </w:rPr>
+        <w:t xml:space="preserve"> </w:t>
       </w:r>
-      <w:r>
-        <w:rPr>
-          <w:highlight w:val="none"/>
-          <w:lang w:val="fr-FR" w:bidi="fr-FR"/>
-        </w:rPr>
-        <w:tab/>
-        <w:tab/>
-      </w:r>
-      <w:r>
-        <w:rPr>
-          <w:highlight w:val="none"/>
-          <w:lang w:val="fr-FR" w:bidi="fr-FR"/>
-        </w:rPr>
-      </w:r>
-      <w:r>
-        <w:rPr>
-          <w:highlight w:val="none"/>
-          <w:lang w:val="fr-FR" w:bidi="fr-FR"/>
-        </w:rPr>
-      </w:r>
+      <w:r/>
     </w:p>
     <w:p>
       <w:pPr>
         <w:pBdr/>
-        <w:spacing/>
-        <w:ind w:left="709"/>
-        <w:rPr>
-          <w:highlight w:val="none"/>
-          <w:lang w:val="fr-FR" w:bidi="fr-FR"/>
-        </w:rPr>
-      </w:pPr>
-      <w:r>
-        <w:rPr>
-          <w:highlight w:val="none"/>
-          <w:lang w:val="fr-FR" w:bidi="fr-FR"/>
-        </w:rPr>
-        <w:t xml:space="preserve">return indexActuelle ;</w:t>
-      </w:r>
-      <w:r>
-        <w:rPr>
-          <w:highlight w:val="none"/>
-          <w:lang w:val="fr-FR" w:bidi="fr-FR"/>
-        </w:rPr>
-      </w:r>
-      <w:r>
-        <w:rPr>
-          <w:highlight w:val="none"/>
-          <w:lang w:val="fr-FR" w:bidi="fr-FR"/>
-        </w:rPr>
-      </w:r>
-      <w:r>
-        <w:rPr>
-          <w:highlight w:val="none"/>
-          <w:lang w:val="fr-FR" w:bidi="fr-FR"/>
-        </w:rPr>
-      </w:r>
-      <w:r>
-        <w:rPr>
-          <w:highlight w:val="none"/>
-          <w:lang w:val="fr-FR" w:bidi="fr-FR"/>
-        </w:rPr>
-      </w:r>
-      <w:r>
-        <w:rPr>
-          <w:highlight w:val="none"/>
-          <w:lang w:val="fr-FR" w:bidi="fr-FR"/>
-        </w:rPr>
-      </w:r>
-      <w:r>
-        <w:rPr>
-          <w:highlight w:val="none"/>
-          <w:lang w:val="fr-FR" w:bidi="fr-FR"/>
-        </w:rPr>
-      </w:r>
-    </w:p>
-    <w:p>
-      <w:pPr>
-        <w:pBdr/>
-        <w:spacing/>
-        <w:ind/>
-        <w:rPr>
-          <w:highlight w:val="none"/>
-          <w:lang w:val="fr-FR" w:bidi="fr-FR"/>
-        </w:rPr>
-      </w:pPr>
-      <w:r>
-        <w:rPr>
-          <w:highlight w:val="none"/>
-          <w:lang w:val="fr-FR" w:bidi="fr-FR"/>
-        </w:rPr>
-        <w:t xml:space="preserve">}</w:t>
-      </w:r>
-      <w:r>
-        <w:rPr>
-          <w:highlight w:val="none"/>
-          <w:lang w:val="fr-FR" w:bidi="fr-FR"/>
-        </w:rPr>
-      </w:r>
-    </w:p>
-    <w:p>
-      <w:pPr>
-        <w:pBdr/>
-        <w:shd w:val="nil"/>
-        <w:spacing/>
-        <w:ind/>
-        <w:rPr>
-          <w:highlight w:val="none"/>
-          <w:lang w:val="fr-FR" w:bidi="fr-FR"/>
-        </w:rPr>
-      </w:pPr>
-      <w:r>
-        <w:rPr>
-          <w:highlight w:val="none"/>
-          <w:lang w:val="fr-FR" w:bidi="fr-FR"/>
-        </w:rPr>
-        <w:br w:type="page" w:clear="all"/>
-      </w:r>
-      <w:r>
-        <w:rPr>
-          <w:highlight w:val="none"/>
-          <w:lang w:val="fr-FR" w:bidi="fr-FR"/>
-        </w:rPr>
-      </w:r>
-      <w:r>
-        <w:rPr>
-          <w:highlight w:val="none"/>
-          <w:lang w:val="fr-FR" w:bidi="fr-FR"/>
-        </w:rPr>
-      </w:r>
-    </w:p>
-    <w:p>
-      <w:pPr>
-        <w:pBdr/>
-        <w:shd w:val="nil" w:color="000000"/>
         <w:spacing/>
         <w:ind/>
         <w:rPr/>
@@ -1956,7 +1759,6 @@
     <w:p>
       <w:pPr>
         <w:pBdr/>
-        <w:shd w:val="nil" w:color="000000"/>
         <w:spacing/>
         <w:ind/>
         <w:rPr/>
@@ -1973,7 +1775,6 @@
     <w:p>
       <w:pPr>
         <w:pBdr/>
-        <w:shd w:val="nil" w:color="000000"/>
         <w:spacing/>
         <w:ind/>
         <w:rPr/>
@@ -1991,7 +1792,6 @@
     <w:p>
       <w:pPr>
         <w:pBdr/>
-        <w:shd w:val="nil" w:color="000000"/>
         <w:spacing/>
         <w:ind/>
         <w:rPr/>
@@ -2009,7 +1809,6 @@
     <w:p>
       <w:pPr>
         <w:pBdr/>
-        <w:shd w:val="nil" w:color="000000"/>
         <w:spacing/>
         <w:ind/>
         <w:rPr/>
@@ -2019,13 +1818,13 @@
           <w:highlight w:val="none"/>
           <w:lang w:val="fr-FR" w:bidi="fr-FR"/>
         </w:rPr>
+        <w:t xml:space="preserve"> </w:t>
       </w:r>
       <w:r/>
     </w:p>
     <w:p>
       <w:pPr>
         <w:pBdr/>
-        <w:shd w:val="nil" w:color="000000"/>
         <w:spacing/>
         <w:ind/>
         <w:rPr/>
@@ -2043,7 +1842,6 @@
     <w:p>
       <w:pPr>
         <w:pBdr/>
-        <w:shd w:val="nil" w:color="000000"/>
         <w:spacing/>
         <w:ind/>
         <w:rPr/>
@@ -2061,7 +1859,6 @@
     <w:p>
       <w:pPr>
         <w:pBdr/>
-        <w:shd w:val="nil" w:color="000000"/>
         <w:spacing/>
         <w:ind/>
         <w:rPr/>
@@ -2079,7 +1876,6 @@
     <w:p>
       <w:pPr>
         <w:pBdr/>
-        <w:shd w:val="nil" w:color="000000"/>
         <w:spacing/>
         <w:ind/>
         <w:rPr/>
@@ -2091,14 +1887,13 @@
         </w:rPr>
         <w:tab/>
         <w:tab/>
-        <w:t xml:space="preserve">// on construit l'arbre pour chaque instruction trouvée dans l'intervalle de façon récursif </w:t>
+        <w:t xml:space="preserve">// on construit l'arbre pour chaque instruction trouvée dans l'intervalle de façon récursive </w:t>
       </w:r>
       <w:r/>
     </w:p>
     <w:p>
       <w:pPr>
         <w:pBdr/>
-        <w:shd w:val="nil" w:color="000000"/>
         <w:spacing/>
         <w:ind/>
         <w:rPr/>
@@ -2117,7 +1912,6 @@
     <w:p>
       <w:pPr>
         <w:pBdr/>
-        <w:shd w:val="nil" w:color="000000"/>
         <w:spacing/>
         <w:ind/>
         <w:rPr/>
@@ -2132,24 +1926,10 @@
         <w:t xml:space="preserve">INoeud enfant = construireArbreSyntaxique(tokensIntervalle, indexLocal) ;</w:t>
       </w:r>
       <w:r/>
-      <w:r>
-        <w:rPr>
-          <w:highlight w:val="none"/>
-          <w:lang w:val="fr-FR" w:bidi="fr-FR"/>
-        </w:rPr>
-      </w:r>
-      <w:r/>
-      <w:r>
-        <w:rPr>
-          <w:highlight w:val="none"/>
-          <w:lang w:val="fr-FR" w:bidi="fr-FR"/>
-        </w:rPr>
-      </w:r>
     </w:p>
     <w:p>
       <w:pPr>
         <w:pBdr/>
-        <w:shd w:val="nil" w:color="000000"/>
         <w:spacing/>
         <w:ind/>
         <w:rPr/>
@@ -2168,7 +1948,6 @@
     <w:p>
       <w:pPr>
         <w:pBdr/>
-        <w:shd w:val="nil" w:color="000000"/>
         <w:spacing/>
         <w:ind/>
         <w:rPr/>
@@ -2182,24 +1961,10 @@
         <w:t xml:space="preserve">}</w:t>
       </w:r>
       <w:r/>
-      <w:r>
-        <w:rPr>
-          <w:highlight w:val="none"/>
-          <w:lang w:val="fr-FR" w:bidi="fr-FR"/>
-        </w:rPr>
-      </w:r>
-      <w:r/>
-      <w:r>
-        <w:rPr>
-          <w:highlight w:val="none"/>
-          <w:lang w:val="fr-FR" w:bidi="fr-FR"/>
-        </w:rPr>
-      </w:r>
     </w:p>
     <w:p>
       <w:pPr>
         <w:pBdr/>
-        <w:shd w:val="nil" w:color="000000"/>
         <w:spacing/>
         <w:ind/>
         <w:rPr/>
@@ -2217,13 +1982,9 @@
     <w:p>
       <w:pPr>
         <w:pBdr/>
-        <w:shd w:val="nil"/>
-        <w:spacing/>
-        <w:ind/>
-        <w:rPr>
-          <w:highlight w:val="none"/>
-          <w:lang w:val="fr-FR" w:bidi="fr-FR"/>
-        </w:rPr>
+        <w:spacing/>
+        <w:ind/>
+        <w:rPr/>
       </w:pPr>
       <w:r>
         <w:rPr>
@@ -2233,64 +1994,45 @@
         <w:t xml:space="preserve">}</w:t>
       </w:r>
       <w:r/>
+    </w:p>
+    <w:p>
+      <w:pPr>
+        <w:pBdr/>
+        <w:spacing/>
+        <w:ind/>
+        <w:rPr/>
+      </w:pPr>
       <w:r>
         <w:rPr>
           <w:highlight w:val="none"/>
           <w:lang w:val="fr-FR" w:bidi="fr-FR"/>
         </w:rPr>
-        <w:br w:type="page" w:clear="all"/>
+        <w:t xml:space="preserve"> </w:t>
       </w:r>
+      <w:r/>
+    </w:p>
+    <w:p>
+      <w:pPr>
+        <w:pBdr/>
+        <w:spacing/>
+        <w:ind/>
+        <w:rPr/>
+      </w:pPr>
       <w:r>
         <w:rPr>
           <w:highlight w:val="none"/>
           <w:lang w:val="fr-FR" w:bidi="fr-FR"/>
         </w:rPr>
+        <w:t xml:space="preserve"> </w:t>
       </w:r>
-      <w:r>
-        <w:rPr>
-          <w:highlight w:val="none"/>
-          <w:lang w:val="fr-FR" w:bidi="fr-FR"/>
-        </w:rPr>
-      </w:r>
+      <w:r/>
     </w:p>
     <w:p>
       <w:pPr>
         <w:pBdr/>
         <w:spacing/>
         <w:ind/>
-        <w:rPr>
-          <w:highlight w:val="none"/>
-          <w:lang w:val="fr-FR" w:bidi="fr-FR"/>
-        </w:rPr>
-      </w:pPr>
-      <w:r>
-        <w:rPr>
-          <w:highlight w:val="none"/>
-          <w:lang w:val="fr-FR" w:bidi="fr-FR"/>
-        </w:rPr>
-      </w:r>
-      <w:r>
-        <w:rPr>
-          <w:highlight w:val="none"/>
-          <w:lang w:val="fr-FR" w:bidi="fr-FR"/>
-        </w:rPr>
-      </w:r>
-      <w:r>
-        <w:rPr>
-          <w:highlight w:val="none"/>
-          <w:lang w:val="fr-FR" w:bidi="fr-FR"/>
-        </w:rPr>
-      </w:r>
-    </w:p>
-    <w:p>
-      <w:pPr>
-        <w:pBdr/>
-        <w:spacing/>
-        <w:ind/>
-        <w:rPr>
-          <w:highlight w:val="none"/>
-          <w:lang w:val="fr-FR" w:bidi="fr-FR"/>
-        </w:rPr>
+        <w:rPr/>
       </w:pPr>
       <w:r>
         <w:rPr>
@@ -2299,22 +2041,14 @@
         </w:rPr>
         <w:t xml:space="preserve">INoeud construireArbreSyntaxique(vecteur&lt;Token&gt; tokens)</w:t>
       </w:r>
-      <w:r>
-        <w:rPr>
-          <w:highlight w:val="none"/>
-          <w:lang w:val="fr-FR" w:bidi="fr-FR"/>
-        </w:rPr>
-      </w:r>
+      <w:r/>
     </w:p>
     <w:p>
       <w:pPr>
         <w:pBdr/>
         <w:spacing/>
         <w:ind/>
-        <w:rPr>
-          <w:highlight w:val="none"/>
-          <w:lang w:val="fr-FR" w:bidi="fr-FR"/>
-        </w:rPr>
+        <w:rPr/>
       </w:pPr>
       <w:r>
         <w:rPr>
@@ -2324,40 +2058,14 @@
         <w:t xml:space="preserve">{</w:t>
         <w:tab/>
       </w:r>
-      <w:r>
-        <w:rPr>
-          <w:highlight w:val="none"/>
-          <w:lang w:val="fr-FR" w:bidi="fr-FR"/>
-        </w:rPr>
-      </w:r>
-      <w:r>
-        <w:rPr>
-          <w:highlight w:val="none"/>
-          <w:lang w:val="fr-FR" w:bidi="fr-FR"/>
-        </w:rPr>
-      </w:r>
-      <w:r>
-        <w:rPr>
-          <w:highlight w:val="none"/>
-          <w:lang w:val="fr-FR" w:bidi="fr-FR"/>
-        </w:rPr>
-      </w:r>
-      <w:r>
-        <w:rPr>
-          <w:highlight w:val="none"/>
-          <w:lang w:val="fr-FR" w:bidi="fr-FR"/>
-        </w:rPr>
-      </w:r>
+      <w:r/>
     </w:p>
     <w:p>
       <w:pPr>
         <w:pBdr/>
         <w:spacing/>
         <w:ind/>
-        <w:rPr>
-          <w:highlight w:val="none"/>
-          <w:lang w:val="fr-FR" w:bidi="fr-FR"/>
-        </w:rPr>
+        <w:rPr/>
       </w:pPr>
       <w:r>
         <w:rPr>
@@ -2365,31 +2073,16 @@
           <w:lang w:val="fr-FR" w:bidi="fr-FR"/>
         </w:rPr>
         <w:tab/>
-        <w:t xml:space="preserve">// Registre d’instruction contenant une lamda de construction de noeud</w:t>
+        <w:t xml:space="preserve">// Registre d’instruction contenant une lambda de construction de nœud stockée dans un dictionnaire, retourne un nœud </w:t>
       </w:r>
-      <w:r>
-        <w:rPr>
-          <w:highlight w:val="none"/>
-          <w:lang w:val="fr-FR" w:bidi="fr-FR"/>
-        </w:rPr>
-        <w:t xml:space="preserve"> stocké dans un dictionnaire, retourne un noeud </w:t>
-      </w:r>
-      <w:r>
-        <w:rPr>
-          <w:highlight w:val="none"/>
-          <w:lang w:val="fr-FR" w:bidi="fr-FR"/>
-        </w:rPr>
-      </w:r>
+      <w:r/>
     </w:p>
     <w:p>
       <w:pPr>
         <w:pBdr/>
         <w:spacing/>
         <w:ind/>
-        <w:rPr>
-          <w:highlight w:val="none"/>
-          <w:lang w:val="fr-FR" w:bidi="fr-FR"/>
-        </w:rPr>
+        <w:rPr/>
       </w:pPr>
       <w:r>
         <w:rPr>
@@ -2397,51 +2090,16 @@
           <w:lang w:val="fr-FR" w:bidi="fr-FR"/>
         </w:rPr>
         <w:tab/>
-        <w:t xml:space="preserve">noeuds = </w:t>
+        <w:t xml:space="preserve">noeuds =  registreInstruction.recuperer(tokens[index].type) ;</w:t>
       </w:r>
-      <w:r>
-        <w:rPr>
-          <w:highlight w:val="none"/>
-          <w:lang w:val="fr-FR" w:bidi="fr-FR"/>
-        </w:rPr>
-        <w:t xml:space="preserve"> registreInstruction.recuperer(</w:t>
-      </w:r>
-      <w:r>
-        <w:rPr>
-          <w:highlight w:val="none"/>
-          <w:lang w:val="fr-FR" w:bidi="fr-FR"/>
-        </w:rPr>
-        <w:t xml:space="preserve">tokens</w:t>
-      </w:r>
-      <w:r>
-        <w:rPr>
-          <w:highlight w:val="none"/>
-          <w:lang w:val="fr-FR" w:bidi="fr-FR"/>
-        </w:rPr>
-        <w:t xml:space="preserve">[index].type) ;</w:t>
-      </w:r>
-      <w:r>
-        <w:rPr>
-          <w:highlight w:val="none"/>
-          <w:lang w:val="fr-FR" w:bidi="fr-FR"/>
-        </w:rPr>
-      </w:r>
-      <w:r>
-        <w:rPr>
-          <w:highlight w:val="none"/>
-          <w:lang w:val="fr-FR" w:bidi="fr-FR"/>
-        </w:rPr>
-      </w:r>
+      <w:r/>
     </w:p>
     <w:p>
       <w:pPr>
         <w:pBdr/>
         <w:spacing/>
         <w:ind/>
-        <w:rPr>
-          <w:highlight w:val="none"/>
-          <w:lang w:val="fr-FR" w:bidi="fr-FR"/>
-        </w:rPr>
+        <w:rPr/>
       </w:pPr>
       <w:r>
         <w:rPr>
@@ -2449,24 +2107,16 @@
           <w:lang w:val="fr-FR" w:bidi="fr-FR"/>
         </w:rPr>
         <w:tab/>
-        <w:t xml:space="preserve">// Récupérer un vecteur de noeud enfant</w:t>
+        <w:t xml:space="preserve">// Récupérer un vecteur de nœuds enfants</w:t>
       </w:r>
-      <w:r>
-        <w:rPr>
-          <w:highlight w:val="none"/>
-          <w:lang w:val="fr-FR" w:bidi="fr-FR"/>
-        </w:rPr>
-      </w:r>
+      <w:r/>
     </w:p>
     <w:p>
       <w:pPr>
         <w:pBdr/>
         <w:spacing/>
         <w:ind/>
-        <w:rPr>
-          <w:highlight w:val="none"/>
-          <w:lang w:val="fr-FR" w:bidi="fr-FR"/>
-        </w:rPr>
+        <w:rPr/>
       </w:pPr>
       <w:r>
         <w:rPr>
@@ -2476,84 +2126,31 @@
         <w:tab/>
         <w:t xml:space="preserve">vecteur&lt;noeud&gt; enfants = obtenirTouteInstructionEnfant()</w:t>
       </w:r>
-      <w:r>
-        <w:rPr>
-          <w:highlight w:val="none"/>
-          <w:lang w:val="fr-FR" w:bidi="fr-FR"/>
-        </w:rPr>
-      </w:r>
-      <w:r>
-        <w:rPr>
-          <w:highlight w:val="none"/>
-          <w:lang w:val="fr-FR" w:bidi="fr-FR"/>
-        </w:rPr>
-      </w:r>
+      <w:r/>
     </w:p>
     <w:p>
       <w:pPr>
         <w:pBdr/>
         <w:spacing/>
         <w:ind/>
-        <w:rPr>
-          <w:highlight w:val="none"/>
-          <w:lang w:val="fr-FR" w:bidi="fr-FR"/>
-        </w:rPr>
-      </w:pPr>
-      <w:r>
-        <w:rPr>
-          <w:highlight w:val="none"/>
-          <w:lang w:val="fr-FR" w:bidi="fr-FR"/>
-        </w:rPr>
-      </w:r>
+        <w:rPr/>
+      </w:pPr>
       <w:r>
         <w:rPr>
           <w:highlight w:val="none"/>
           <w:lang w:val="fr-FR" w:bidi="fr-FR"/>
         </w:rPr>
         <w:tab/>
-        <w:t xml:space="preserve">// Ajouter les noeud </w:t>
+        <w:t xml:space="preserve">// Ajouter les nœuds à l’arbre syntaxique abstrait</w:t>
       </w:r>
-      <w:r>
-        <w:rPr>
-          <w:highlight w:val="none"/>
-          <w:lang w:val="fr-FR" w:bidi="fr-FR"/>
-        </w:rPr>
-        <w:t xml:space="preserve">à l’arbre syntaxique abstrait</w:t>
-      </w:r>
-      <w:r>
-        <w:rPr>
-          <w:highlight w:val="none"/>
-          <w:lang w:val="fr-FR" w:bidi="fr-FR"/>
-        </w:rPr>
-      </w:r>
-      <w:r>
-        <w:rPr>
-          <w:highlight w:val="none"/>
-          <w:lang w:val="fr-FR" w:bidi="fr-FR"/>
-        </w:rPr>
-      </w:r>
-      <w:r>
-        <w:rPr>
-          <w:highlight w:val="none"/>
-          <w:lang w:val="fr-FR" w:bidi="fr-FR"/>
-        </w:rPr>
-      </w:r>
-      <w:r>
-        <w:rPr>
-          <w:highlight w:val="none"/>
-          <w:lang w:val="fr-FR" w:bidi="fr-FR"/>
-        </w:rPr>
-      </w:r>
+      <w:r/>
     </w:p>
     <w:p>
       <w:pPr>
         <w:pBdr/>
         <w:spacing/>
         <w:ind/>
-        <w:rPr>
-          <w:highlight w:val="none"/>
-          <w:lang w:val="fr-FR" w:bidi="fr-FR"/>
-        </w:rPr>
+        <w:rPr/>
       </w:pPr>
       <w:r>
         <w:rPr>
@@ -2561,115 +2158,28 @@
           <w:lang w:val="fr-FR" w:bidi="fr-FR"/>
         </w:rPr>
         <w:tab/>
-        <w:t xml:space="preserve">noeuds.</w:t>
+        <w:t xml:space="preserve">noeuds.ajouterInstruction(enfants)</w:t>
+        <w:tab/>
+        <w:tab/>
       </w:r>
-      <w:r>
-        <w:rPr>
-          <w:highlight w:val="none"/>
-          <w:lang w:val="fr-FR" w:bidi="fr-FR"/>
-        </w:rPr>
-        <w:t xml:space="preserve">ajouterInstruction(enfants)</w:t>
-      </w:r>
-      <w:r>
-        <w:rPr>
-          <w:highlight w:val="none"/>
-          <w:lang w:val="fr-FR" w:bidi="fr-FR"/>
-        </w:rPr>
-      </w:r>
-      <w:r>
-        <w:rPr>
-          <w:highlight w:val="none"/>
-          <w:lang w:val="fr-FR" w:bidi="fr-FR"/>
-        </w:rPr>
-      </w:r>
+      <w:r/>
+    </w:p>
+    <w:p>
+      <w:pPr>
+        <w:pBdr/>
+        <w:spacing/>
+        <w:ind/>
+        <w:rPr/>
+      </w:pPr>
       <w:r>
         <w:rPr>
           <w:highlight w:val="none"/>
           <w:lang w:val="fr-FR" w:bidi="fr-FR"/>
         </w:rPr>
         <w:tab/>
+        <w:t xml:space="preserve">return noeuds ; </w:t>
       </w:r>
-      <w:r>
-        <w:rPr>
-          <w:highlight w:val="none"/>
-          <w:lang w:val="fr-FR" w:bidi="fr-FR"/>
-        </w:rPr>
-      </w:r>
-      <w:r>
-        <w:rPr>
-          <w:highlight w:val="none"/>
-          <w:lang w:val="fr-FR" w:bidi="fr-FR"/>
-        </w:rPr>
-      </w:r>
-      <w:r>
-        <w:rPr>
-          <w:highlight w:val="none"/>
-          <w:lang w:val="fr-FR" w:bidi="fr-FR"/>
-        </w:rPr>
-      </w:r>
-      <w:r>
-        <w:rPr>
-          <w:highlight w:val="none"/>
-          <w:lang w:val="fr-FR" w:bidi="fr-FR"/>
-        </w:rPr>
-        <w:tab/>
-      </w:r>
-      <w:r>
-        <w:rPr>
-          <w:highlight w:val="none"/>
-          <w:lang w:val="fr-FR" w:bidi="fr-FR"/>
-        </w:rPr>
-      </w:r>
-      <w:r>
-        <w:rPr>
-          <w:highlight w:val="none"/>
-          <w:lang w:val="fr-FR" w:bidi="fr-FR"/>
-        </w:rPr>
-      </w:r>
-      <w:r>
-        <w:rPr>
-          <w:highlight w:val="none"/>
-          <w:lang w:val="fr-FR" w:bidi="fr-FR"/>
-        </w:rPr>
-      </w:r>
-      <w:r>
-        <w:rPr>
-          <w:highlight w:val="none"/>
-          <w:lang w:val="fr-FR" w:bidi="fr-FR"/>
-        </w:rPr>
-      </w:r>
-    </w:p>
-    <w:p>
-      <w:pPr>
-        <w:pBdr/>
-        <w:spacing/>
-        <w:ind/>
-        <w:rPr>
-          <w:highlight w:val="none"/>
-          <w:lang w:val="fr-FR" w:bidi="fr-FR"/>
-        </w:rPr>
-      </w:pPr>
-      <w:r>
-        <w:rPr>
-          <w:highlight w:val="none"/>
-          <w:lang w:val="fr-FR" w:bidi="fr-FR"/>
-        </w:rPr>
-        <w:tab/>
-        <w:t xml:space="preserve">return </w:t>
-      </w:r>
-      <w:r>
-        <w:rPr>
-          <w:highlight w:val="none"/>
-          <w:lang w:val="fr-FR" w:bidi="fr-FR"/>
-        </w:rPr>
-        <w:t xml:space="preserve">noeuds ; </w:t>
-      </w:r>
-      <w:r>
-        <w:rPr>
-          <w:highlight w:val="none"/>
-          <w:lang w:val="fr-FR" w:bidi="fr-FR"/>
-        </w:rPr>
-      </w:r>
+      <w:r/>
     </w:p>
     <w:p>
       <w:pPr>
@@ -2688,6 +2198,7 @@
         </w:rPr>
         <w:t xml:space="preserve">}</w:t>
       </w:r>
+      <w:r/>
       <w:r>
         <w:rPr>
           <w:highlight w:val="none"/>

</xml_diff>